<commit_message>
feat: reestructurar organización de archivos del CV
- Mover archivos de entrada a subcarpetas sections/{declaraciones,experiencias,competencias,otros}
- Actualizar ruta de la foto de perfil a assets/images/profile/
- Corregir ruta del archivo de bibliografía a bibliography/
- Agregar nueva sección de anexos (12_anexos)

Esta reestructuración mejora la organización del proyecto
al separar los archivos por tipo de contenido.
</commit_message>
<xml_diff>
--- a/assets/anexos/20260123 constancia de trabajo cau unsch.docx
+++ b/assets/anexos/20260123 constancia de trabajo cau unsch.docx
@@ -12,11 +12,30 @@
         </w:rPr>
       </w:pPr>
       <w:r>
+        <w:rPr>
+          <w:rFonts w:cs="Times New Roman" w:ascii="Times New Roman" w:hAnsi="Times New Roman"/>
+          <w:sz w:val="24"/>
+          <w:szCs w:val="24"/>
+        </w:rPr>
+        <w:tab/>
+      </w:r>
+    </w:p>
+    <w:p>
+      <w:pPr>
+        <w:pStyle w:val="Header"/>
+        <w:ind w:start="1134"/>
+        <w:jc w:val="both"/>
+        <w:rPr>
+          <w:b/>
+          <w:bCs/>
+        </w:rPr>
+      </w:pPr>
+      <w:r>
         <w:drawing>
-          <wp:anchor behindDoc="0" distT="0" distB="0" distL="114300" distR="114300" simplePos="0" locked="0" layoutInCell="0" allowOverlap="1" relativeHeight="3">
+          <wp:anchor distT="0" distB="0" distL="114300" distR="114300" simplePos="0" relativeHeight="3" behindDoc="0" locked="0" layoutInCell="0" allowOverlap="1">
             <wp:simplePos x="0" y="0"/>
             <wp:positionH relativeFrom="column">
-              <wp:posOffset>5036185</wp:posOffset>
+              <wp:posOffset>-484505</wp:posOffset>
             </wp:positionH>
             <wp:positionV relativeFrom="paragraph">
               <wp:posOffset>635</wp:posOffset>
@@ -62,25 +81,6 @@
       <w:r>
         <w:rPr>
           <w:rFonts w:cs="Times New Roman" w:ascii="Times New Roman" w:hAnsi="Times New Roman"/>
-          <w:sz w:val="24"/>
-          <w:szCs w:val="24"/>
-        </w:rPr>
-        <w:tab/>
-      </w:r>
-    </w:p>
-    <w:p>
-      <w:pPr>
-        <w:pStyle w:val="Header"/>
-        <w:ind w:start="1134"/>
-        <w:jc w:val="both"/>
-        <w:rPr>
-          <w:b/>
-          <w:bCs/>
-        </w:rPr>
-      </w:pPr>
-      <w:r>
-        <w:rPr>
-          <w:rFonts w:cs="Times New Roman" w:ascii="Times New Roman" w:hAnsi="Times New Roman"/>
           <w:b/>
           <w:bCs/>
           <w:sz w:val="28"/>
@@ -379,7 +379,25 @@
           <w:szCs w:val="24"/>
           <w:lang w:val="es-ES"/>
         </w:rPr>
-        <w:t xml:space="preserve"> con documento de identidad N° 76932189, viene laborando desde el 12 de noviembre del 2025 como </w:t>
+        <w:t xml:space="preserve"> con documento de identidad N° 76932189, viene laborando desde el 12 de noviembre del 2025 </w:t>
+      </w:r>
+      <w:r>
+        <w:rPr>
+          <w:rFonts w:cs="Times New Roman" w:ascii="Times New Roman" w:hAnsi="Times New Roman"/>
+          <w:sz w:val="24"/>
+          <w:szCs w:val="24"/>
+          <w:lang w:val="es-ES"/>
+        </w:rPr>
+        <w:t xml:space="preserve">hasta 28 de febrero de 2026 </w:t>
+      </w:r>
+      <w:r>
+        <w:rPr>
+          <w:rFonts w:cs="Times New Roman" w:ascii="Times New Roman" w:hAnsi="Times New Roman"/>
+          <w:sz w:val="24"/>
+          <w:szCs w:val="24"/>
+          <w:lang w:val="es-ES"/>
+        </w:rPr>
+        <w:t xml:space="preserve">como </w:t>
       </w:r>
       <w:r>
         <w:rPr>
@@ -459,7 +477,7 @@
       </w:pPr>
       <w:r>
         <w:drawing>
-          <wp:anchor behindDoc="1" distT="0" distB="0" distL="0" distR="0" simplePos="0" locked="0" layoutInCell="1" allowOverlap="1" relativeHeight="2">
+          <wp:anchor distT="0" distB="0" distL="0" distR="0" simplePos="0" relativeHeight="2" behindDoc="1" locked="0" layoutInCell="1" allowOverlap="1">
             <wp:simplePos x="0" y="0"/>
             <wp:positionH relativeFrom="column">
               <wp:posOffset>1828800</wp:posOffset>
@@ -513,25 +531,43 @@
           <w:szCs w:val="24"/>
           <w:lang w:val="es-ES"/>
         </w:rPr>
-        <w:t xml:space="preserve">Ayacucho, 23 de </w:t>
-      </w:r>
-      <w:r>
-        <w:rPr>
-          <w:rFonts w:cs="Times New Roman" w:ascii="Times New Roman" w:hAnsi="Times New Roman"/>
-          <w:sz w:val="24"/>
-          <w:szCs w:val="24"/>
-          <w:lang w:val="es-ES"/>
-        </w:rPr>
-        <w:t>enero</w:t>
-      </w:r>
-      <w:r>
-        <w:rPr>
-          <w:rFonts w:cs="Times New Roman" w:ascii="Times New Roman" w:hAnsi="Times New Roman"/>
-          <w:sz w:val="24"/>
-          <w:szCs w:val="24"/>
-          <w:lang w:val="es-ES"/>
-        </w:rPr>
-        <w:t xml:space="preserve"> del 2026</w:t>
+        <w:t xml:space="preserve">Ayacucho,  </w:t>
+      </w:r>
+      <w:r>
+        <w:rPr>
+          <w:rFonts w:cs="Times New Roman" w:ascii="Times New Roman" w:hAnsi="Times New Roman"/>
+          <w:sz w:val="24"/>
+          <w:szCs w:val="24"/>
+          <w:lang w:val="es-ES"/>
+        </w:rPr>
+        <w:t xml:space="preserve">07 </w:t>
+      </w:r>
+      <w:r>
+        <w:rPr>
+          <w:rFonts w:cs="Times New Roman" w:ascii="Times New Roman" w:hAnsi="Times New Roman"/>
+          <w:sz w:val="24"/>
+          <w:szCs w:val="24"/>
+          <w:lang w:val="es-ES"/>
+        </w:rPr>
+        <w:t xml:space="preserve">de </w:t>
+      </w:r>
+      <w:r>
+        <w:rPr>
+          <w:rFonts w:cs="Times New Roman" w:ascii="Times New Roman" w:hAnsi="Times New Roman"/>
+          <w:sz w:val="24"/>
+          <w:szCs w:val="24"/>
+          <w:lang w:val="es-ES"/>
+        </w:rPr>
+        <w:t xml:space="preserve">marzo </w:t>
+      </w:r>
+      <w:r>
+        <w:rPr>
+          <w:rFonts w:cs="Times New Roman" w:ascii="Times New Roman" w:hAnsi="Times New Roman"/>
+          <w:sz w:val="24"/>
+          <w:szCs w:val="24"/>
+          <w:lang w:val="es-ES"/>
+        </w:rPr>
+        <w:t>del 2026</w:t>
       </w:r>
     </w:p>
     <w:p>
@@ -1267,37 +1303,37 @@
         <a:srgbClr val="000000"/>
       </a:dk1>
       <a:lt1>
-        <a:srgbClr val="ffffff"/>
+        <a:srgbClr val="FFFFFF"/>
       </a:lt1>
       <a:dk2>
-        <a:srgbClr val="44546a"/>
+        <a:srgbClr val="44546A"/>
       </a:dk2>
       <a:lt2>
-        <a:srgbClr val="e7e6e6"/>
+        <a:srgbClr val="E7E6E6"/>
       </a:lt2>
       <a:accent1>
-        <a:srgbClr val="4472c4"/>
+        <a:srgbClr val="4472C4"/>
       </a:accent1>
       <a:accent2>
-        <a:srgbClr val="ed7d31"/>
+        <a:srgbClr val="ED7D31"/>
       </a:accent2>
       <a:accent3>
-        <a:srgbClr val="a5a5a5"/>
+        <a:srgbClr val="A5A5A5"/>
       </a:accent3>
       <a:accent4>
-        <a:srgbClr val="ffc000"/>
+        <a:srgbClr val="FFC000"/>
       </a:accent4>
       <a:accent5>
-        <a:srgbClr val="5b9bd5"/>
+        <a:srgbClr val="5B9BD5"/>
       </a:accent5>
       <a:accent6>
-        <a:srgbClr val="70ad47"/>
+        <a:srgbClr val="70AD47"/>
       </a:accent6>
       <a:hlink>
-        <a:srgbClr val="0563c1"/>
+        <a:srgbClr val="0563C1"/>
       </a:hlink>
       <a:folHlink>
-        <a:srgbClr val="954f72"/>
+        <a:srgbClr val="954F72"/>
       </a:folHlink>
     </a:clrScheme>
     <a:fontScheme name="Office">

</xml_diff>